<commit_message>
docs: update technical specifications, add RDS and UI design screenshot assets
</commit_message>
<xml_diff>
--- a/technical_docs/API_Docs.docx
+++ b/technical_docs/API_Docs.docx
@@ -350,7 +350,7 @@
               <w:rPr>
                 <w:rFonts w:ascii="Calibri" w:hAnsi="Calibri"/>
               </w:rPr>
-              <w:t>1.1.0 (Bản nâng cấp Epic)</w:t>
+              <w:t>1.1.0</w:t>
             </w:r>
           </w:p>
         </w:tc>
@@ -405,7 +405,7 @@
               <w:rPr>
                 <w:rFonts w:ascii="Calibri" w:hAnsi="Calibri"/>
               </w:rPr>
-              <w:t>Software Engineer &amp; Tech Lead (20 năm kinh nghiệm)</w:t>
+              <w:t>Nhóm phát triển dự án SWP391</w:t>
             </w:r>
           </w:p>
         </w:tc>
@@ -460,7 +460,7 @@
               <w:rPr>
                 <w:rFonts w:ascii="Calibri" w:hAnsi="Calibri"/>
               </w:rPr>
-              <w:t>Sẵn sàng trình duyệt</w:t>
+              <w:t>Sẵn sàng báo cáo</w:t>
             </w:r>
           </w:p>
         </w:tc>
@@ -550,7 +550,7 @@
         <w:rPr>
           <w:rFonts w:ascii="Calibri" w:hAnsi="Calibri"/>
         </w:rPr>
-        <w:t>Các API được phân tách chặt chẽ theo các phân hệ nghiệp vụ (Epics) để nhóm phát triển dễ dàng chia Sprint thực hiện độc lập.</w:t>
+        <w:t>Các API được phân tách chặt chẽ theo các phân hệ nghiệp vụ (Epics) để nhóm chúng em dễ dàng phân chia công việc phát triển độc lập.</w:t>
       </w:r>
     </w:p>
     <w:p>

</xml_diff>